<commit_message>
Convierte el email y LinkedIn del CV en hipervínculos reales
Antes eran texto plano con apariencia de enlace pero sin
<w:hyperlink> en el OOXML — hallazgo de la revisión previa a fusionar
el PR #83.

Co-Authored-By: Claude Sonnet 5 <noreply@anthropic.com>
Claude-Session: https://claude.ai/code/session_012cTrmKnajgZbTDRsTMvpWi
</commit_message>
<xml_diff>
--- a/personal/cv-mindrift.docx
+++ b/personal/cv-mindrift.docx
@@ -23,13 +23,43 @@
         <w:spacing w:after="200"/>
         <w:jc w:val="center"/>
       </w:pPr>
+      <w:hyperlink w:history="1" r:id="rIdp5cxkwjjkffsqjasp9nqo">
+        <w:r>
+          <w:rPr>
+            <w:color w:val="1155CC"/>
+            <w:sz w:val="18"/>
+            <w:szCs w:val="18"/>
+            <w:u w:val="single"/>
+          </w:rPr>
+          <w:t xml:space="preserve">angelluisacosta99@gmail.com</w:t>
+        </w:r>
+      </w:hyperlink>
       <w:r>
         <w:rPr>
           <w:color w:val="595959"/>
           <w:sz w:val="18"/>
           <w:szCs w:val="18"/>
         </w:rPr>
-        <w:t xml:space="preserve">angelluisacosta99@gmail.com  ·  linkedin.com/in/angel-luis-acosta-gonzález-b173b7201  ·  Teléfono: [pendiente — número español]</w:t>
+        <w:t xml:space="preserve">  ·  </w:t>
+      </w:r>
+      <w:hyperlink w:history="1" r:id="rIdfphp9gayxmav07nxjv_ct">
+        <w:r>
+          <w:rPr>
+            <w:color w:val="1155CC"/>
+            <w:sz w:val="18"/>
+            <w:szCs w:val="18"/>
+            <w:u w:val="single"/>
+          </w:rPr>
+          <w:t xml:space="preserve">linkedin.com/in/angel-luis-acosta-gonzález-b173b7201</w:t>
+        </w:r>
+      </w:hyperlink>
+      <w:r>
+        <w:rPr>
+          <w:color w:val="595959"/>
+          <w:sz w:val="18"/>
+          <w:szCs w:val="18"/>
+        </w:rPr>
+        <w:t xml:space="preserve">  ·  Teléfono: [pendiente — número español]</w:t>
       </w:r>
     </w:p>
     <w:p>

</xml_diff>